<commit_message>
v22.46: PRJ11 A and B 500 ml per 10 cm (Eyal 11 Oct)
Eyal, 11 Oct 2026: "irrigation prj11 should be each 10cm 500ml only AB". PRJ11-A, PRJ11-B and any pool added to room PRJ11 take
0.5 L of A and 0.5 L of B per 10 cm of water added — with or without an EC reading, over-tank water × 2, 0.1 L steps (20 cm → 1 L,
21 cm → 1.1 L); C unchanged. PRJ12/15/16 keep the EC matrix. Today's PRJ11 rounds are worked out again on the Pool Monitor (the
v22.42 stale check); past days keep their recommendation. Guide + Word guide; tests irr-prj11-v2246 (2 cases); the matrix case of
irr-dose.test moves to PRJ12-A; the paired-rooms case expects PRJ11 → 0.5.

Co-Authored-By: Claude Opus 5.5 <noreply@anthropic.com>
Claude-Session: https://claude.ai/code/session_01T49gnSNZq31rPRt1vHk4Rc
</commit_message>
<xml_diff>
--- a/nexidoc/Nexi_User_Guide_v22.46.docx
+++ b/nexidoc/Nexi_User_Guide_v22.46.docx
@@ -15,7 +15,7 @@
         <w:rPr>
           <w:color w:val="556660"/>
         </w:rPr>
-        <w:t>ABA Pardes Agritech Corp. · Version 22.46 · 10 October 2026</w:t>
+        <w:t>ABA Pardes Agritech Corp. · Version 22.46 · 11 October 2026</w:t>
       </w:r>
     </w:p>
     <w:p>
@@ -7021,7 +7021,7 @@
     </w:p>
     <w:p>
       <w:r>
-        <w:t>A and B (each): 1 litre per 10 cm of water added — GH1, GH2, GH3 &amp; GH4, GH5, GH6, GH7 &amp; GH8 and GH10; GH9: 2 litres per 10 cm. Shown to 0.1 L (6 cm → 0.6 L = 600 cc). The project pools (PRJ), not named in this rule, keep the EC matrix until their litres per 10 cm are set in Pool &amp; Drum Setup.</w:t>
+        <w:t>A and B (each): 1 litre per 10 cm of water added — GH1, GH2, GH3 &amp; GH4, GH5, GH6, GH7 &amp; GH8 and GH10; GH9: 2 litres per 10 cm. Shown to 0.1 L (6 cm → 0.6 L = 600 cc). PRJ11 (PRJ11-A and PRJ11-B): 500 ml of A and 500 ml of B per 10 cm (Eyal, 11 Oct — v22.46), also to 0.1 L, so 20 cm → 1 L and 21 cm → 1.1 L. The other project pools (PRJ12, PRJ15, PRJ16), not named in the rule, keep the EC matrix until their litres per 10 cm are set in Pool &amp; Drum Setup.</w:t>
       </w:r>
     </w:p>
     <w:p>

</xml_diff>